<commit_message>
feat: integrate 5-month Telegram question bank and channels into notes and Master Wiki
</commit_message>
<xml_diff>
--- a/RPSC_UPSC_Daily_AI_Agent/Output_Notes/RAS_UPSC_Notes_2026-09-16.docx
+++ b/RPSC_UPSC_Daily_AI_Agent/Output_Notes/RAS_UPSC_Notes_2026-09-16.docx
@@ -24,10 +24,10 @@
         <w:rPr>
           <w:b/>
         </w:rPr>
-        <w:t xml:space="preserve">• [EPFO वेतन सीमा में वृद्धि] </w:t>
+        <w:t xml:space="preserve">• [किसऊ बहुउद्देशीय परियोजना (Kishau Multipurpose Project)] </w:t>
       </w:r>
       <w:r>
-        <w:t>कर्मचारी भविष्य निधि संगठन (EPFO) की अनिवार्य सामाजिक सुरक्षा कवरेज हेतु मासिक वेतन सीमा को ₹15,000 से बढ़ाकर ₹25,000 कर दिया गया है। इससे लगभग 50 लाख से 1 करोड़ नए कर्मचारी सामाजिक सुरक्षा के दायरे में आएंगे। यह संशोधन 17 सितंबर 2026 से लागू होगा।</w:t>
+        <w:t>टोंस नदी (यमुना की सबसे बड़ी सहायक नदी) पर 422 मेगावॉट की परियोजना। लागत केंद्र:राज्य अनुपात 90:10 (हिमाचल प्रदेश, उत्तराखंड, दिल्ली, उत्तर प्रदेश, राजस्थान, हरियाणा)।</w:t>
       </w:r>
     </w:p>
     <w:p>
@@ -35,10 +35,10 @@
         <w:rPr>
           <w:b/>
         </w:rPr>
-        <w:t xml:space="preserve">• [शाहज़ाद भट्टी नेटवर्क UAPA के तहत प्रतिबंधित] </w:t>
+        <w:t xml:space="preserve">• [विश्व खाद्य कार्यक्रम (World Food Programme - WFP)] </w:t>
       </w:r>
       <w:r>
-        <w:t>गृह मंत्रालय (MHA) ने गैर-कानूनी गतिविधियां (निवारण) अधिनियम (UAPA), 1967 के तहत 'शाहज़ाद भट्टी नेटवर्क' को आतंकवादी संगठन घोषित कर प्रतिबंधित कर दिया है।</w:t>
+        <w:t>स्थापना 1961 (FAO व UNGA द्वारा), मुख्यालय रोम (इटली)। वर्ष 2020 में नोबेल शांति पुरस्कार। यह संस्था 100% स्वैच्छिक योगदान पर निर्भर है।</w:t>
       </w:r>
     </w:p>
     <w:p>
@@ -46,10 +46,10 @@
         <w:rPr>
           <w:b/>
         </w:rPr>
-        <w:t xml:space="preserve">• [सेवा संकल्प अभियान (Seva Sankalp Abhiyan)] </w:t>
+        <w:t xml:space="preserve">• [शहजाद भट्टी नेटवर्क आतंकवादी संगठन घोषित] </w:t>
       </w:r>
       <w:r>
-        <w:t>प्रधानमंत्री नरेंद्र मोदी के 76वें जन्मदिवस के उपलक्ष्य में 17 सितंबर से 17 अक्टूबर 2026 तक एक माह लंबा 'सेवा संकल्प अभियान' संचालित किया जाएगा, जिसके तहत स्वास्थ्य शिविर, स्वच्छता और सामाजिक कल्याण कार्य किए जाएंगे।</w:t>
+        <w:t>गृह मंत्रालय (MHA) ने गैर-कानूनी गतिविधियां (निवारण) अधिनियम (UAPA), 1967 के तहत 'शहजाद भट्टी नेटवर्क' को आतंकवादी संगठन घोषित किया।</w:t>
       </w:r>
     </w:p>
     <w:p>
@@ -57,10 +57,10 @@
         <w:rPr>
           <w:b/>
         </w:rPr>
-        <w:t xml:space="preserve">• [जल उपयोग दक्षता (Water Use Effectiveness - WUE)] </w:t>
+        <w:t xml:space="preserve">• [डाटा सेंटर जल उपभोग प्रक्षेपण 2030 (Rystad Energy Report)] </w:t>
       </w:r>
       <w:r>
-        <w:t>WUE डेटा केंद्रों द्वारा प्रति यूनिट आईटी ऊर्जा (kWh) में उपभोग किए जाने वाले जल को मापने का एक मानक मीट्रिक है। सिंगापुर ग्रीन डेटा सेंटर रोडमैप के अनुसार यह मानक 2 लीटर/kWh (2 m³/MWh) से कम होना चाहिए।</w:t>
+        <w:t>वैश्विक डेटा केंद्रों का प्रत्यक्ष कूलिंग जल उपभोग 2025 में 222 अरब लीटर से बढ़कर 2030 तक 644 अरब लीटर हो सकता है। वाटर यूज़ इफ़ेक्टिवनेस (WUE) इसका मानक मापक है।</w:t>
       </w:r>
     </w:p>
     <w:p>
@@ -68,10 +68,10 @@
         <w:rPr>
           <w:b/>
         </w:rPr>
-        <w:t xml:space="preserve">• [दीनोडोंटोसॉरस इसियावामैंडा (Dinodontosaurus isiyavamanda)] </w:t>
+        <w:t xml:space="preserve">• [динодоन्टोसॉरस इसियावामैंडा (Dinodontosaurus isiyavamanda)] </w:t>
       </w:r>
       <w:r>
-        <w:t>तंजानिया में खोजा गया 240 मिलियन वर्ष पुराना जीवाश्म, जो पूर्व में केवल दक्षिण अमेरिका में पाया जाता था। यह खोज डायनासोर के शुरुआती कालक्रम और गोंडवाना महाद्वीप के जीवाश्म जुड़ाव को पुनर्गठित करती है।</w:t>
+        <w:t>तंजानिया में मिला 240 मिलियन वर्ष पुराना जीवाश्म, जो दक्षिण अमरीकी जीवाश्मों से जुड़ता है और शुरुआती डायनासोर कालक्रम के पुनर्मूल्यांकन का कारण बना है।</w:t>
       </w:r>
     </w:p>
     <w:p>
@@ -79,10 +79,10 @@
         <w:rPr>
           <w:b/>
         </w:rPr>
-        <w:t xml:space="preserve">• [cGAS प्रतिरक्षा सेंसर और त्वरित आयु-वृद्धि] </w:t>
+        <w:t xml:space="preserve">• [EPFO वेतन सीमा वृद्धि (Wage Ceiling Hike)] </w:t>
       </w:r>
       <w:r>
-        <w:t>वैज्ञानिकों ने पाया कि कोशिका में टूटे हुए डीएनए (DNA) अंशों के बाहर आने पर cGAS (Cyclic GMP-AMP Synthase) सेंसर उन्हें वायरल संक्रमण समझकर अत्यधिक सूजन (Chronic Inflammation) और तेजी से आयु-वृद्धि (Rapid Aging) उत्पन्न करता है।</w:t>
+        <w:t>कर्मचारी भविष्य निधि संगठन (EPFO) में अनिवार्य सामाजिक सुरक्षा हेतु वेतन सीमा 15,000 रुपये से बढ़ाकर 25,000 रुपये प्रति माह कर दी गई है।</w:t>
       </w:r>
     </w:p>
     <w:p>
@@ -90,10 +90,10 @@
         <w:rPr>
           <w:b/>
         </w:rPr>
-        <w:t xml:space="preserve">• [क्षुद्रग्रह चारिकलो (Chariklo) का वलय तंत्र] </w:t>
+        <w:t xml:space="preserve">• [विक्रम साराभाई स्पेस प्रदर्शनी का शुभारंभ] </w:t>
       </w:r>
       <w:r>
-        <w:t>जेम्स वेब स्पेस टेलीस्कोप (JWST) ने पाया कि शनि और यूरेनस के बीच परिक्रमा करने वाले छोटे निकाय 'चारिकलो' के वलयों में तीव्र गति से भौतिक परिवर्तन हो रहे हैं—इसका आंतरिक वलय अधिक अपारदर्शी तथा बाहरी वलय कम अपारदर्शी हो रहा है।</w:t>
+        <w:t>राजस्थान के अलवर जिले में अंतरिक्ष विज्ञान को बढ़ावा देने हेतु 'विक्रम साराभाई स्पेस प्रदर्शनी' का उद्घाटन किया गया।</w:t>
       </w:r>
     </w:p>
     <w:p>
@@ -101,10 +101,10 @@
         <w:rPr>
           <w:b/>
         </w:rPr>
-        <w:t xml:space="preserve">• [हैदराबाद मुक्ति दिवस (17 सितंबर)] </w:t>
+        <w:t xml:space="preserve">• [राजीव गांधी स्मृति लाइफटाइम अचीवमेंट अवॉर्ड] </w:t>
       </w:r>
       <w:r>
-        <w:t>17 सितंबर 1948 को ऑपरेशन पोलो (Operation Polo) के माध्यम से हैदराबाद रियासत का भारत संघ में विलय हुआ था। 2026 में सिकंदराबाद परेड ग्राउंड में उपराष्ट्रपति की मुख्य आतिथ्य में समारोह आयोजित किया जा रहा है।</w:t>
+        <w:t>राजस्थान क्रिकेट को बढ़ावा देने के उत्कृष्ट योगदान हेतु डॉ. सीपी जोशी को 'राजीव गांधी स्मृति लाइफटाइम अचीवमेंट अवॉर्ड' से सम्मानित किया जाएगा।</w:t>
       </w:r>
     </w:p>
     <w:p>
@@ -112,10 +112,10 @@
         <w:rPr>
           <w:b/>
         </w:rPr>
-        <w:t xml:space="preserve">• [विशेष अभियान 6.0 (Special Campaign 6.0)] </w:t>
+        <w:t xml:space="preserve">• [कॉप्स टर्फ ग्राउंड (Indoor Cricket Stadium)] </w:t>
       </w:r>
       <w:r>
-        <w:t>आवासन एवं शहरी कार्य मंत्रालय द्वारा 2 अक्टूबर से 31 अक्टूबर 2026 तक सरकारी कार्यालयों में स्वच्छता, लंबित मामलों के निपटान और स्क्रैप निस्तारण हेतु 'विशेष अभियान 6.0' चलाया जाएगा।</w:t>
+        <w:t>आधुनिक सुविधाओं से युक्त नए इनडोर क्रिकेट स्टेडियम 'कॉप्स टर्फ ग्राउंड' का निर्माण जयपुर में किया गया है।</w:t>
       </w:r>
     </w:p>
     <w:p>
@@ -123,10 +123,10 @@
         <w:rPr>
           <w:b/>
         </w:rPr>
-        <w:t xml:space="preserve">• [बाब-अल-मंदेब जलडमरूमध्य (Bab-al-Mandeb Strait)] </w:t>
+        <w:t xml:space="preserve">• [मिशन पढ़ो राजस्थान] </w:t>
       </w:r>
       <w:r>
-        <w:t>यह लाल सागर (Red Sea) को अदन की खाड़ी (Gulf of Aden) से जोड़ता है। यमन की तटरेखा पर स्थित यह जलडमरूमध्य वैश्विक ऊर्जा परिवहन और स्वेज नहर के माध्यम से यूरोप-एशिया व्यापार का प्रमुख चोक-पॉइंट (Choke-point) है।</w:t>
+        <w:t>राजस्थान शिक्षा विभाग द्वारा प्राथमिक शिक्षा में गुणवत्ता सुधार हेतु 'मिशन पढ़ो राजस्थान' कक्षा 1 से 5वीं तक के विद्यार्थियों के लिए संचालित किया जा रहा है।</w:t>
       </w:r>
     </w:p>
     <w:p>
@@ -134,10 +134,10 @@
         <w:rPr>
           <w:b/>
         </w:rPr>
-        <w:t xml:space="preserve">• [हिमालयी नदी जल प्रवाह पराकाष्ठा (Peak Water)] </w:t>
+        <w:t xml:space="preserve">• [आभानेरी की चांद बावड़ी व ऐतिहासिक हवेलियां] </w:t>
       </w:r>
       <w:r>
-        <w:t>हालिया वैज्ञानिक रिपोर्ट के अनुसार, ग्लोबल वार्मिंग और ग्लेशियरों के पिघलने के कारण मध्य-शताब्दी (2050) तक हिमालयी नदियों में 'पीक वॉटर' की स्थिति आ जाएगी, जिसके बाद वार्षिक नदी प्रवाह में गिरावट शुरू हो जाएगी।</w:t>
+        <w:t>चांद बावड़ी आभानेरी (दौसा) में स्थित कलात्मक बावड़ी है। बीकानेर में बच्छावतों, रामपुरिया, गुलेच्छा एवं सेठिया की प्रसिद्ध हवेलियां स्थित हैं।</w:t>
       </w:r>
     </w:p>
     <w:p>
@@ -145,10 +145,10 @@
         <w:rPr>
           <w:b/>
         </w:rPr>
-        <w:t xml:space="preserve">• [डीम्ड डिस्कॉम (Deemed DISCOM) दर्जा] </w:t>
+        <w:t xml:space="preserve">• [पृथ्वी की उत्पत्ति का नया सिद्धांत (Nature Study)] </w:t>
       </w:r>
       <w:r>
-        <w:t>आंध्र प्रदेश सरकार ने गूगल के 1 गीगावाट (GW) डेटा सेंटर प्रोजेक्ट को 'डीम्ड डिस्कॉम' का लाइसेंस दिया है, जिससे कंपनी स्वयं बिजली की खरीद और प्रबंधन कर सकेगी।</w:t>
+        <w:t>नवीनतम अध्ययन के अनुसार पृथ्वी का निर्माण मुख्य रूप से आंतरिक सौर मंडल के पदार्थों से हुआ है, जिससे जल की उपस्थिति सूर्य के निकटवर्ती क्षेत्रों में साबित होती है।</w:t>
       </w:r>
     </w:p>
     <w:p>
@@ -164,15 +164,15 @@
         <w:rPr>
           <w:b/>
         </w:rPr>
-        <w:t>प्रश्न [5 अंक - Paper 1]: UPI भुगतानों पर मर्चेंट डिस्काउंट रेट (MDR) लागू करने के आर्थिक औचित्य तथा डिजिटल फिनटेक इंफ्रास्ट्रक्चर की स्थिरता पर इसके प्रभाव की समीक्षा कीजिए।</w:t>
+        <w:t>प्रश्न [5 अंक - Paper 1]: यूपीआई पर मर्चेंट डिस्काउंट रेट (MDR) लागू करने के आर्थिक औचित्य एवं इसके संभावित प्रभावों की समीक्षा कीजिए।</w:t>
         <w:br/>
       </w:r>
       <w:r>
-        <w:t>उत्तर: • **आर्थिक औचित्य:** नीति आयोग एवं वित्त मंत्रालय के अनुसार, ₹2,000 से अधिक के व्यापारी लेनदेन पर 0.4% MDR लगाने का उद्देश्य फिनटेक पारितंत्र को अनिश्चितकालीन सरकारी सब्सिडी पर निर्भर रखने के बजाय आत्मनिर्भर बनाना है।</w:t>
+        <w:t>उत्तर: 1. आर्थिक औचित्य: एनपीसीआई व बैंकों के बुनियादी ढांचे के रखरखाव (वार्षिक लागत ~₹8000 करोड़) को वित्तीय रूप से आत्मनिर्भर (Self-sustainable) बनाना।</w:t>
         <w:br/>
-        <w:t>• **राजस्व सृजन:** इससे अनुमानित ₹16,000 करोड़ का राजस्व प्राप्त होगा, जो बैंकों व भुगतान ऐप्स की सर्वर क्षमता और साइबर सुरक्षा को मजबूत करेगा।</w:t>
+        <w:t>2. मुख्य प्रावधान: ₹2000 से अधिक के व्यापारी लेनदेन पर 0.4% शुल्क (अधिकतम ₹300)। व्यक्ति-से-व्यक्ति (P2P) व छोटे व्यापारी पूरी तरह मुक्त।</w:t>
         <w:br/>
-        <w:t>• **उपभोक्ता संरक्षण:** व्यक्ति-से-व्यक्ति (P2P) तथा छोटे किराना/व्यापारी लेनदेन पूरी तरह मुक्त रहेंगे, जिससे वित्तीय समावेशन पर विपरीत प्रभाव नहीं पड़ेगा।</w:t>
+        <w:t>3. संभावित प्रभाव: डिजिटल भुगतान पारिस्थितिकी तंत्र की सुरक्षा व स्केलेबिलिटी में सुधार; हालांकि व्यापारियों द्वारा अप्रत्यक्ष रूप से अंतिम ग्राहकों पर मूल्य भार स्थानांतरित करने का जोखिम।</w:t>
         <w:br/>
       </w:r>
     </w:p>
@@ -181,15 +181,15 @@
         <w:rPr>
           <w:b/>
         </w:rPr>
-        <w:t>प्रश्न [5 अंक - Paper 3]: डेटा सेंटरों के तीव्र वैश्विक विस्तार से उत्पन्न जल सुरक्षा (Water Footprint) एवं स्थानीय तापमान वृद्धि संबंधी चुनौतियों का विश्लेषण कीजिए।</w:t>
+        <w:t>प्रश्न [5 अंक - Paper 2]: किसऊ बहुउद्देशीय परियोजना किस प्रकार भारत में 'सहकारी संघवाद' (Cooperative Federalism) का एक उत्कृष्ट उदाहरण है? स्पष्ट कीजिए।</w:t>
         <w:br/>
       </w:r>
       <w:r>
-        <w:t>उत्तर: • **जल खपत संकट:** AI और कंप्यूटिंग क्षमता वृद्धि से डेटा सेंटरों की जल खपत 2025 में 222 अरब लीटर से बढ़कर 2030 तक 644 अरब लीटर (Rystad Energy रिपोर्ट) होने का अनुमान है।</w:t>
+        <w:t>उत्तर: 1. अंतर-राज्यीय सहयोग: हिमाचल प्रदेश, उत्तराखंड, दिल्ली, उत्तर प्रदेश, राजस्थान एवं हरियाणा (6 राज्य/यूटी) के मध्य टोंस नदी पर जल बंटवारे व लागत साझाकरण का समझौता।</w:t>
         <w:br/>
-        <w:t>• **हीट आइलैंड प्रभाव:** डेटा सेंटरों के कूलिंग टावरों और निकास से 10 किमी के दायरे में स्थानीय तापमान 9°C तक बढ़ सकता है।</w:t>
+        <w:t>2. वित्तीय ढांचा: कुल ₹15,624 करोड़ की लागत में 90% केंद्र सरकार द्वारा तथा 10% सहभागी राज्यों/केंद्रशासित प्रदेशों द्वारा वहन।</w:t>
         <w:br/>
-        <w:t>• **अप्रत्यक्ष जल पदचिह्न (Indirect Footprint):** ड्राई कूलिंग तकनीक से प्रत्यक्ष जल की बचत होती है, लेकिन बिजली की मांग बढ़ने से पावर प्लांटों में अप्रत्यक्ष जल खपत 2 गुनी हो जाती है।</w:t>
+        <w:t>3. बहु-आयामी लाभ: दिल्ली को पेयजल, 97,000 हेक्टेयर में सिंचाई तथा 422 मेगावाट स्वच्छ जलविद्युत उत्पादन के साथ क्षेत्रीय जल व ऊर्जा सुरक्षा सुनिश्चित होगी।</w:t>
         <w:br/>
       </w:r>
     </w:p>
@@ -198,37 +198,25 @@
         <w:rPr>
           <w:b/>
         </w:rPr>
-        <w:t>प्रश्न [10 अंक - Paper 3]: पश्चिम एशिया में बाब-अल-मंदेब और लाल सागर क्षेत्र में जारी अशांति का वैश्विक आपूर्ति श्रृंखला, समुद्री सुरक्षा और भारत के आर्थिक हितों पर पड़ने वाले प्रभावों का आलोचनात्मक परीक्षण कीजिए।</w:t>
+        <w:t>प्रश्न [10 अंक - Paper 3]: हिमालयी क्षेत्र में 'पीक वाटर' (Peak Water) की अवधारणा को स्पष्ट करते हुए ग्लेशियल लेक आउटबर्स्ट फ्लड (GLOF) एवं जल सुरक्षा पर इसके गंभीर प्रभावों का विश्लेषण कीजिए।</w:t>
         <w:br/>
       </w:r>
       <w:r>
-        <w:t>भूमिका: बाब-अल-मंदेब जलडमरूमध्य लाल सागर को अदन की खाड़ी से जोड़ने वाला एक अत्यंत संकीर्ण समुद्री मार्ग (Choke Point) है, जहां यमन के हूति विद्रोहियों के हमलों से वैश्विक समुद्री व्यापार संकट में पड़ गया है।</w:t>
+        <w:t>भूमिका: हालिया जलवायु रिपोर्टों के अनुसार, ग्लोबल वार्मिंग के कारण हिमालयी हिमनद तीव्र गति से पिघल रहे हैं, जिससे यह पारिस्थितिकी तंत्र 'पीक वाटर' नामक गंभीर टिपिंग पॉइंट की ओर बढ़ रहा है।</w:t>
         <w:br/>
       </w:r>
       <w:r>
-        <w:t>मुख्य भाग: 1. **वैश्विक आपूर्ति श्रृंखला पर प्रभाव:**</w:t>
+        <w:t>मुख्य भाग: 1. पीक वाटर का अर्थ: वह समय-बिंदु जब ग्लेशियरों के अत्यधिक पिघलने से नदियों का वार्षिक जल प्रवाह अपने अधिकतम स्तर (Peak) पर पहुँच जाता है, जिसके पश्चात प्रवाह में स्थायी व तीव्र गिरावट दर्ज की जाती है (अनुमानित 2050-2060 तक)।</w:t>
         <w:br/>
-        <w:t xml:space="preserve">   - स्वेज नहर मार्ग बाधित होने से जहाजों को 'केप ऑफ गुड होप' (दक्षिण अफ्रीका) से घूमकर जाना पड़ रहा है, जिससे यात्रा में 10-14 दिन का अतिरिक्त समय और 30-40% अधिक ईंधन खर्च हो रहा है।</w:t>
+        <w:t>2. जलविज्ञान चक्र पर प्रभाव (U-Turn Flow): प्रारंभ में अत्यधिक पिघलन से भीषण बाढ़ (नेपाल व तिब्बत सीमा की घटनाएं), तत्पश्चात ग्लेशियर समाप्त होने पर नदियां मौसमी बन जाएंगी तथा भयानक सूखा पड़ेगा।</w:t>
         <w:br/>
-        <w:t xml:space="preserve">   - फ्रेट (भाड़ा) दरें और समुद्री बीमा (Marine Insurance) प्रीमियम में अत्यधिक वृद्धि से वैश्विक मुद्रास्फीति बढ़ी है।</w:t>
+        <w:t>3. GLOF का खतरा: हिमनदों के खिसकने से बनने वाली 'ग्लेशियर झीलें' अस्थिर हो जाती हैं। इनके टूटने से निचले घाटियों में तबाही, जलविद्युत बुनियादी ढांचे का विनाश व आजीविका संकट होता है।</w:t>
         <w:br/>
-        <w:br/>
-        <w:t>2. **भारत के आर्थिक व ऊर्जा हितों पर आघात:**</w:t>
-        <w:br/>
-        <w:t xml:space="preserve">   - भारत का यूरोप और उत्तरी अमेरिका के साथ लगभग 35-40% व्यापार इसी मार्ग से होता है।</w:t>
-        <w:br/>
-        <w:t xml:space="preserve">   - कच्चे तेल और एलएनजी (LNG) के आयात लागत में वृद्धि से भारत का चालू खाता घाटा (CAD) प्रभावित होने का जोखिम है।</w:t>
-        <w:br/>
-        <w:br/>
-        <w:t>3. **भू-राजनीतिक व सुरक्षा आयाम:**</w:t>
-        <w:br/>
-        <w:t xml:space="preserve">   - ईरान द्वारा हुतियों का छद्म उपयोग (Proxy War) तथा सऊदी अरब-यमन संघर्ष इस क्षेत्र को अस्थिर कर रहा है।</w:t>
-        <w:br/>
-        <w:t xml:space="preserve">   - भारत ने 'ऑपरेशन संकल्प' के तहत भारतीय नौसेना के युद्धपोत तैनात कर व्यापारी जहाजों की सुरक्षा सुनिश्चित की है।</w:t>
+        <w:t>4. सामाजिक-आर्थिक प्रभाव: भारत की जीडीपी में 20% से अधिक योगदान देने वाला हिमालयी क्षेत्र खाद्य सुरक्षा, पेयजल तथा जलविद्युत उत्पादन में गंभीर संकट का सामना करेगा।</w:t>
         <w:br/>
       </w:r>
       <w:r>
-        <w:t>निष्कर्ष: निष्कर्षतः, भारत को अंतर्राष्ट्रीय समुद्री सुरक्षा गठबंधनों के साथ समन्वय स्थापित करते हुए वैकल्पिक व्यापार मार्गों और रणनीतिक पेट्रोलियम भंडार (SPR) को मजबूत करने की आवश्यकता है।</w:t>
+        <w:t>निष्कर्ष: हिमालयी क्षेत्र में पूर्व चेतावनी प्रणालियों (EWS), टिकाऊ इंफ्रास्ट्रक्चर निर्माण तथा जलवायु-अनुकूलन नीतियों के माध्यम से जल व आपदा सुरक्षा सुनिश्चित करना अत्यंत आवश्यक है।</w:t>
         <w:br/>
       </w:r>
     </w:p>
@@ -237,39 +225,285 @@
         <w:rPr>
           <w:b/>
         </w:rPr>
-        <w:t>प्रश्न [10 अंक - Paper 1]: "कृत्रिम बुद्धिमत्ता (AI) के युग में भारत का आर्थिक भविष्य केवल बड़े भाषा मॉडल (LLM) विकसित करने में नहीं, बल्कि एंटरप्राइज इंटीग्रेशन, एडवांस्ड चिप पैकेजिंग और डेटा लेबलिंग श्रम के संरक्षण में निहित है।" व्याख्या कीजिए।</w:t>
+        <w:t>प्रश्न [10 अंक - Paper 1]: भारत के जीडीपी आधार वर्ष (Base Year) में 2011-12 से 2022-23 के संशोधन के मुख्य कारणों, असंगठित क्षेत्र के मापन में सुधार तथा इसके आंकड़ों पर पड़े प्रभावों की विस्तृत विवेचना कीजिए।</w:t>
         <w:br/>
       </w:r>
       <w:r>
-        <w:t>भूमिका: मुख्य आर्थिक सलाहकार (CEA) वी. अनंत नागेश्वरन तथा उद्योग विशेषज्ञों के अनुसार, AI क्रांति में भारत को विस्थापन के बजाय 'मानव-श्रम संवर्धन' (Labor Augmentation) का मॉडल अपनाना होगा।</w:t>
+        <w:t>भूमिका: केंद्रीय सांख्यिकी संगठन द्वारा राष्ट्रीय लेखा सांख्यिकी के सटीकता सुधार हेतु जीडीपी के आधार वर्ष को 2011-12 से परिवर्तित कर 2022-23 किया गया है, जो अर्थव्यवस्था के वास्तविक स्वरूप को दर्शाता है।</w:t>
         <w:br/>
       </w:r>
       <w:r>
-        <w:t>मुख्य भाग: 1. **फैब से परे चिप पैकेजिंग (Advanced Packaging Opportunity):**</w:t>
+        <w:t>मुख्य भाग: 1. संशोधन के मुख्य कारण: अर्थशास्त्र की नई संरचनात्मक गतिविधियों को शामिल करना, पुराने अनुमानित/प्रॉक्सी आंकड़ों के स्थान पर वास्तविक सर्वेक्षण डेटा का प्रयोग।</w:t>
         <w:br/>
-        <w:t xml:space="preserve">   - अरबों डॉलर के सेमीकंडक्टर फैब्रिकेशन (Fab) स्थापित करने के स्थान पर भारत कम पूंजी वाली 'एडवांस्ड पैकेजिंग' (OSAT/ATMP) में वैश्विक केंद्र बन सकता है, जिससे प्रतिभा और सिस्टम इकोसिस्टम तैयार होगा।</w:t>
+        <w:t>2. असंगठित क्षेत्र (Unorganised Sector) का सटीक मापन: पूर्व में असंगठित क्षेत्र की गणना अनुमानों पर आधारित थी। नई श्रृंखला में 'असंगठित क्षेत्र उद्यमों का वार्षिक सर्वेक्षण' (ASUSE) तथा आवधिक श्रम बल सर्वेक्षण (PLFS) के सटीक डेटा का उपयोग किया गया है।</w:t>
         <w:br/>
+        <w:t>3. आंकड़ों पर प्रभाव:</w:t>
         <w:br/>
-        <w:t>2. **एंटरप्राइज AI और IT सेवाएं:**</w:t>
+        <w:t xml:space="preserve">   - नॉमिनल जीडीपी के आकार में 3% से 4% की कमी दर्ज की गई क्योंकि पुराने अनुमानों में अति-आकलन था।</w:t>
         <w:br/>
-        <w:t xml:space="preserve">   - मूलभूत AI मॉडल (जैसे ChatGPT/Claude) कमोडिटी बनते जा रहे हैं। वास्तविक मूल्य उन मॉडलों को कॉरपोरेट/एंटरप्राइज उपयोग हेतु अनुकूलित (Customize) करने में है, जहां भारतीय आईटी कंपनियों (TCS, Infosys) का वर्चस्व है।</w:t>
+        <w:t xml:space="preserve">   - कृषि, रियल एस्टेट व वित्तीय सेवाओं के जीवीए (GVA) में वृद्धि, जबकि व्यापार व परिवहन क्षेत्र में 23-26% की गिरावट देखी गई।</w:t>
         <w:br/>
-        <w:br/>
-        <w:t>3. **दृश्यमान एवं अदृश्य डेटा श्रम (Digital Data Labelers):**</w:t>
-        <w:br/>
-        <w:t xml:space="preserve">   - अरण्य सहाय की फिल्म 'ह्यूमन्स इन द लूप' के संदर्भ में, AI की स्वायत्तता एक भ्रम है; यह लाखों अनफॉर्मल/आदिवासी डेटा लेबलर्स के श्रम पर टिकी है।</w:t>
-        <w:br/>
-        <w:t xml:space="preserve">   - भारत को इन अदृश्य डिजिटल श्रमिकों हेतु सामाजिक सुरक्षा, उचित मजदूरी और कार्यस्थल गरिमा का नियामक ढांचा बनाना होगा।</w:t>
-        <w:br/>
-        <w:br/>
-        <w:t>4. **उत्पादकता संवर्धन मॉडल:**</w:t>
-        <w:br/>
-        <w:t xml:space="preserve">   - AI का उपयोग श्रमिकों को बदलने (Replacing) के बजाय उनकी दक्षता बढ़ाने (Augmenting) हेतु किया जाना चाहिए, जैसा कि कृषि, स्वास्थ्य और शिक्षा क्षेत्र में संभावित है।</w:t>
+        <w:t xml:space="preserve">   - सांख्यिकीय सटीकता से 'बेस इफेक्ट' में सुधार तथा नीति निर्माण हेतु अधिक विश्वसनीय समष्टि-आर्थिक आंकड़े प्राप्त हुए।</w:t>
         <w:br/>
       </w:r>
       <w:r>
-        <w:t>निष्कर्ष: भारत को 'तकनीकी औपनिवेशिक डेटा प्रदाता' बनने के बजाय डेटा स्वामित्त्व, श्रम संरक्षण और एंटरप्राइज इंटीग्रेशन पर ध्यान केंद्रित कर टिकाऊ AI अर्थव्यवस्था का निर्माण करना चाहिए।</w:t>
+        <w:t>निष्कर्ष: आधार वर्ष का यह अद्यतनीकरण वैश्विक मानकों के अनुकूल है, जिससे भारत की आर्थिक वृद्धि दर की वास्तविक और पारदर्शी छवि वैश्विक निवेशकों के समक्ष प्रस्तुत होती है।</w:t>
         <w:br/>
+      </w:r>
+    </w:p>
+    <w:p>
+      <w:pPr>
+        <w:pStyle w:val="Heading1"/>
+      </w:pPr>
+      <w:r>
+        <w:t>3. टेलीग्राम चैनल दैनिक प्रश्नोत्तरी व नोट्स (Telegram Daily Quiz &amp; Notes)</w:t>
+      </w:r>
+    </w:p>
+    <w:p>
+      <w:r>
+        <w:rPr>
+          <w:b/>
+        </w:rPr>
+        <w:t>[@Rajasthan_History_Polity_Culture] बच्छावतों, रामपुरिया, गुलेच्छा, सेठिया की हवेली राजस्थान में कहां स्थित है?</w:t>
+        <w:br/>
+      </w:r>
+    </w:p>
+    <w:p>
+      <w:r>
+        <w:t xml:space="preserve">  • A) जैसलमेर</w:t>
+      </w:r>
+    </w:p>
+    <w:p>
+      <w:r>
+        <w:t xml:space="preserve">  • B) सीकर</w:t>
+      </w:r>
+    </w:p>
+    <w:p>
+      <w:r>
+        <w:t xml:space="preserve">  • C) जोधपुर</w:t>
+      </w:r>
+    </w:p>
+    <w:p>
+      <w:r>
+        <w:t xml:space="preserve">  • D) बीकानेर</w:t>
+      </w:r>
+    </w:p>
+    <w:p>
+      <w:r>
+        <w:t xml:space="preserve">  उत्तर/व्याख्या: D) बीकानेर। बीकानेर अपनी भव्य नक्काशीदार लाल पत्थर की हवेलियों के लिए प्रसिद्ध है, जिनमें बच्छावतों की हवेली सबसे प्राचीन है।</w:t>
+      </w:r>
+    </w:p>
+    <w:p>
+      <w:r>
+        <w:rPr>
+          <w:b/>
+        </w:rPr>
+        <w:t>[@Rajasthan_History_Polity_Culture] राजस्थान के इतिहास व संस्कृति से संबंधित महत्वपूर्ण एक-पंक्ति तथ्य</w:t>
+        <w:br/>
+      </w:r>
+    </w:p>
+    <w:p>
+      <w:r>
+        <w:t xml:space="preserve">  • 1. बैलगाड़ी मेला -&gt; शीतला माता उत्सव (चाकसू)</w:t>
+      </w:r>
+    </w:p>
+    <w:p>
+      <w:r>
+        <w:t xml:space="preserve">  • 2. लूनी की सहायक नदियां -&gt; सूकड़ी, बांडी, जवाई</w:t>
+      </w:r>
+    </w:p>
+    <w:p>
+      <w:r>
+        <w:t xml:space="preserve">  • 3. मांगीलाल मिस्त्री का संबंध -&gt; कावड़ लोक-कला</w:t>
+      </w:r>
+    </w:p>
+    <w:p>
+      <w:r>
+        <w:t xml:space="preserve">  • 4. चौली मध्यम सिंचाई परियोजना -&gt; झालावाड़</w:t>
+      </w:r>
+    </w:p>
+    <w:p>
+      <w:r>
+        <w:t xml:space="preserve">  • 5. कालीबंगा सभ्यता स्थल -&gt; हनुमानगढ़ जिला</w:t>
+      </w:r>
+    </w:p>
+    <w:p>
+      <w:r>
+        <w:t xml:space="preserve">  उत्तर/व्याख्या: सभी तथ्यात्मक मिलान सही हैं। मांगीलाल मिस्त्री कावड़ कला (काष्ठ कला) के प्रसिद्ध कलाकार हैं।</w:t>
+      </w:r>
+    </w:p>
+    <w:p>
+      <w:r>
+        <w:rPr>
+          <w:b/>
+        </w:rPr>
+        <w:t>[@Rajasthan_History_Polity_Culture] राजस्थानी चित्रकला के संदर्भ में निम्नलिखित कथनों में से सही पहचानें:</w:t>
+        <w:br/>
+        <w:t>A. 1916 ई. में आनंद कुमार स्वामी ने 'राजपूत पेंटिंग' पुस्तक लिखी जिसमें पहाड़ी चित्रशैली को भी शामिल किया।</w:t>
+        <w:br/>
+        <w:t>B. डब्ल्यू एच ब्राउन ने अपने ग्रंथ 'इंडियन पेंटिंग्स' में इसे 'राजस्थानी चित्रकला' कहा।</w:t>
+        <w:br/>
+      </w:r>
+    </w:p>
+    <w:p>
+      <w:r>
+        <w:t xml:space="preserve">  • A) केवल A</w:t>
+      </w:r>
+    </w:p>
+    <w:p>
+      <w:r>
+        <w:t xml:space="preserve">  • B) केवल B</w:t>
+      </w:r>
+    </w:p>
+    <w:p>
+      <w:r>
+        <w:t xml:space="preserve">  • C) A और B दोनों</w:t>
+      </w:r>
+    </w:p>
+    <w:p>
+      <w:r>
+        <w:t xml:space="preserve">  • D) इनमें से कोई नहीं</w:t>
+      </w:r>
+    </w:p>
+    <w:p>
+      <w:r>
+        <w:t xml:space="preserve">  उत्तर/व्याख्या: C) A और B दोनों सही हैं। आनंद कुमार स्वामी ने पहली बार राजस्थानी चित्रकला का वैज्ञानिक विभाजन प्रस्तुत किया था।</w:t>
+      </w:r>
+    </w:p>
+    <w:p>
+      <w:r>
+        <w:rPr>
+          <w:b/>
+        </w:rPr>
+        <w:t>[@Rajasthan_History_Polity_Culture] चित्रकला की 'सावर उपशैली' का संबंध किस स्कूल ऑफ पेंटिंग से है?</w:t>
+        <w:br/>
+      </w:r>
+    </w:p>
+    <w:p>
+      <w:r>
+        <w:t xml:space="preserve">  • A) मारवाड़ पेंटिंग स्कूल</w:t>
+      </w:r>
+    </w:p>
+    <w:p>
+      <w:r>
+        <w:t xml:space="preserve">  • B) मेवाड़ पेंटिंग स्कूल</w:t>
+      </w:r>
+    </w:p>
+    <w:p>
+      <w:r>
+        <w:t xml:space="preserve">  • C) ढूंढाड़ पेंटिंग स्कूल</w:t>
+      </w:r>
+    </w:p>
+    <w:p>
+      <w:r>
+        <w:t xml:space="preserve">  • D) हाड़ौती पेंटिंग स्कूल</w:t>
+      </w:r>
+    </w:p>
+    <w:p>
+      <w:r>
+        <w:t xml:space="preserve">  उत्तर/व्याख्या: B) मेवाड़ पेंटिंग स्कूल। सावर उपशैली मेवाड़ स्कूल की एक लघु चित्रशैली शाखा है।</w:t>
+      </w:r>
+    </w:p>
+    <w:p>
+      <w:r>
+        <w:rPr>
+          <w:b/>
+        </w:rPr>
+        <w:t>[@Rajasthan_History_Polity_Culture] राजस्थान में 'लोकनायक' के नाम से किसे जाना जाता है तथा 'आगीबाण' समाचार पत्र के संपादक कौन थे?</w:t>
+        <w:br/>
+      </w:r>
+    </w:p>
+    <w:p>
+      <w:r>
+        <w:t xml:space="preserve">  • A) मोहन लाल सुखाड़िया</w:t>
+      </w:r>
+    </w:p>
+    <w:p>
+      <w:r>
+        <w:t xml:space="preserve">  • B) जयनारायण व्यास</w:t>
+      </w:r>
+    </w:p>
+    <w:p>
+      <w:r>
+        <w:t xml:space="preserve">  • C) हीरालाल शास्त्री</w:t>
+      </w:r>
+    </w:p>
+    <w:p>
+      <w:r>
+        <w:t xml:space="preserve">  • D) हरिदेव जोशी</w:t>
+      </w:r>
+    </w:p>
+    <w:p>
+      <w:r>
+        <w:t xml:space="preserve">  उत्तर/व्याख्या: B) जयनारायण व्यास। जयनारायण व्यास को 'लोकनायक' व 'शेर-ए-राजस्थान' कहा जाता है। इन्होंने ब्यावर से राजस्थानी भाषा के प्रथम राजनीतिक पत्र 'आगीबाण' (1932) का संपादन किया।</w:t>
+      </w:r>
+    </w:p>
+    <w:p>
+      <w:r>
+        <w:rPr>
+          <w:b/>
+        </w:rPr>
+        <w:t>[@Rajasthan_History_Polity_Culture] मेवाड़ प्रजामण्डल की स्थापना अप्रैल 1938 में किसके द्वारा की गई?</w:t>
+        <w:br/>
+      </w:r>
+    </w:p>
+    <w:p>
+      <w:r>
+        <w:t xml:space="preserve">  • A) माणिक्य लाल वर्मा</w:t>
+      </w:r>
+    </w:p>
+    <w:p>
+      <w:r>
+        <w:t xml:space="preserve">  • B) मोहनलाल सुखाड़िया</w:t>
+      </w:r>
+    </w:p>
+    <w:p>
+      <w:r>
+        <w:t xml:space="preserve">  • C) भोगीलाल पाण्ड्य</w:t>
+      </w:r>
+    </w:p>
+    <w:p>
+      <w:r>
+        <w:t xml:space="preserve">  • D) पंडित गौरीशंकर</w:t>
+      </w:r>
+    </w:p>
+    <w:p>
+      <w:r>
+        <w:t xml:space="preserve">  उत्तर/व्याख्या: A) माणिक्य लाल वर्मा। बलवंत सिंह मेहता इसके प्रथम अध्यक्ष थे तथा माणिक्य लाल वर्मा इसके मुख्य संस्थापक/मुख्य सचिव थे।</w:t>
+      </w:r>
+    </w:p>
+    <w:p>
+      <w:r>
+        <w:rPr>
+          <w:b/>
+        </w:rPr>
+        <w:t>[@Rajasthan_History_Polity_Culture] राजस्थान इतिहास एवं स्थापत्य से संबंधित महत्वपूर्ण तथ्य</w:t>
+        <w:br/>
+      </w:r>
+    </w:p>
+    <w:p>
+      <w:r>
+        <w:t xml:space="preserve">  • 1. कछवाह वंश -&gt; शासक भारमल (आमेर)</w:t>
+      </w:r>
+    </w:p>
+    <w:p>
+      <w:r>
+        <w:t xml:space="preserve">  • 2. झालावाड़ का गढ़ महल -&gt; महाराजा राणा मदन सिंह (1838)</w:t>
+      </w:r>
+    </w:p>
+    <w:p>
+      <w:r>
+        <w:t xml:space="preserve">  • 3. राजपूताना संग्रहालय (अजमेर) के प्रथम संग्रहाध्यक्ष -&gt; डॉ. गौरीशंकर हीराचंद ओझा</w:t>
+      </w:r>
+    </w:p>
+    <w:p>
+      <w:r>
+        <w:t xml:space="preserve">  • 4. बनीवाला की ढाणी (नीम का थाना) -&gt; तांबा (Copper) खनिज भंडार</w:t>
+      </w:r>
+    </w:p>
+    <w:p>
+      <w:r>
+        <w:t xml:space="preserve">  उत्तर/व्याख्या: सभी ऐतिहासिक तथ्य 100% सही हैं। नीम का थाना का बनीवाला क्षेत्र तांबे के नए भंडारों हेतु जाना जाता है।</w:t>
       </w:r>
     </w:p>
     <w:sectPr>

</xml_diff>